<commit_message>
Research demand, costs, node assignment, and potential IA implementation approaches
</commit_message>
<xml_diff>
--- a/docs_mar_san/questions_second_meeting.docx
+++ b/docs_mar_san/questions_second_meeting.docx
@@ -10,8 +10,37 @@
           <w:numId w:val="1"/>
         </w:numPr>
       </w:pPr>
-      <w:r>
-        <w:t xml:space="preserve">Como usar la IA en el proyecto? Se debe de usar en demanda y condiciones de transito? Como se usaría? </w:t>
+      <w:proofErr w:type="gramStart"/>
+      <w:r>
+        <w:t>Como usar la IA en el proyecto?</w:t>
+      </w:r>
+      <w:proofErr w:type="gramEnd"/>
+      <w:r>
+        <w:t xml:space="preserve"> </w:t>
+      </w:r>
+      <w:proofErr w:type="gramStart"/>
+      <w:r>
+        <w:t xml:space="preserve">Se debe de usar en demanda y condiciones de </w:t>
+      </w:r>
+      <w:proofErr w:type="spellStart"/>
+      <w:r>
+        <w:t>transito</w:t>
+      </w:r>
+      <w:proofErr w:type="spellEnd"/>
+      <w:r>
+        <w:t>?</w:t>
+      </w:r>
+      <w:proofErr w:type="gramEnd"/>
+      <w:r>
+        <w:t xml:space="preserve"> </w:t>
+      </w:r>
+      <w:proofErr w:type="gramStart"/>
+      <w:r>
+        <w:t>Como se usaría?</w:t>
+      </w:r>
+      <w:proofErr w:type="gramEnd"/>
+      <w:r>
+        <w:t xml:space="preserve"> </w:t>
       </w:r>
     </w:p>
     <w:p>
@@ -29,7 +58,287 @@
         <w:rPr>
           <w:rFonts w:ascii="Times New Roman" w:eastAsia="Times New Roman" w:hAnsi="Times New Roman" w:cs="Times New Roman"/>
         </w:rPr>
-        <w:t>La modelització es durà a terme a partir de dades reals de la ciutat de Barcelona, considerant criteris operatius, ambientals i socioespacials, i integrant la possibilitat de prioritzar zones amb major vulnerabilitat per afavorir una distribució més justa i sostenible.</w:t>
+        <w:t xml:space="preserve">La </w:t>
+      </w:r>
+      <w:proofErr w:type="spellStart"/>
+      <w:r>
+        <w:rPr>
+          <w:rFonts w:ascii="Times New Roman" w:eastAsia="Times New Roman" w:hAnsi="Times New Roman" w:cs="Times New Roman"/>
+        </w:rPr>
+        <w:t>modelització</w:t>
+      </w:r>
+      <w:proofErr w:type="spellEnd"/>
+      <w:r>
+        <w:rPr>
+          <w:rFonts w:ascii="Times New Roman" w:eastAsia="Times New Roman" w:hAnsi="Times New Roman" w:cs="Times New Roman"/>
+        </w:rPr>
+        <w:t xml:space="preserve"> es </w:t>
+      </w:r>
+      <w:proofErr w:type="spellStart"/>
+      <w:r>
+        <w:rPr>
+          <w:rFonts w:ascii="Times New Roman" w:eastAsia="Times New Roman" w:hAnsi="Times New Roman" w:cs="Times New Roman"/>
+        </w:rPr>
+        <w:t>durà</w:t>
+      </w:r>
+      <w:proofErr w:type="spellEnd"/>
+      <w:r>
+        <w:rPr>
+          <w:rFonts w:ascii="Times New Roman" w:eastAsia="Times New Roman" w:hAnsi="Times New Roman" w:cs="Times New Roman"/>
+        </w:rPr>
+        <w:t xml:space="preserve"> a </w:t>
+      </w:r>
+      <w:proofErr w:type="spellStart"/>
+      <w:r>
+        <w:rPr>
+          <w:rFonts w:ascii="Times New Roman" w:eastAsia="Times New Roman" w:hAnsi="Times New Roman" w:cs="Times New Roman"/>
+        </w:rPr>
+        <w:t>terme</w:t>
+      </w:r>
+      <w:proofErr w:type="spellEnd"/>
+      <w:r>
+        <w:rPr>
+          <w:rFonts w:ascii="Times New Roman" w:eastAsia="Times New Roman" w:hAnsi="Times New Roman" w:cs="Times New Roman"/>
+        </w:rPr>
+        <w:t xml:space="preserve"> a partir de dades </w:t>
+      </w:r>
+      <w:proofErr w:type="spellStart"/>
+      <w:r>
+        <w:rPr>
+          <w:rFonts w:ascii="Times New Roman" w:eastAsia="Times New Roman" w:hAnsi="Times New Roman" w:cs="Times New Roman"/>
+        </w:rPr>
+        <w:t>reals</w:t>
+      </w:r>
+      <w:proofErr w:type="spellEnd"/>
+      <w:r>
+        <w:rPr>
+          <w:rFonts w:ascii="Times New Roman" w:eastAsia="Times New Roman" w:hAnsi="Times New Roman" w:cs="Times New Roman"/>
+        </w:rPr>
+        <w:t xml:space="preserve"> de la </w:t>
+      </w:r>
+      <w:proofErr w:type="spellStart"/>
+      <w:r>
+        <w:rPr>
+          <w:rFonts w:ascii="Times New Roman" w:eastAsia="Times New Roman" w:hAnsi="Times New Roman" w:cs="Times New Roman"/>
+        </w:rPr>
+        <w:t>ciutat</w:t>
+      </w:r>
+      <w:proofErr w:type="spellEnd"/>
+      <w:r>
+        <w:rPr>
+          <w:rFonts w:ascii="Times New Roman" w:eastAsia="Times New Roman" w:hAnsi="Times New Roman" w:cs="Times New Roman"/>
+        </w:rPr>
+        <w:t xml:space="preserve"> de Barcelona, </w:t>
+      </w:r>
+      <w:proofErr w:type="spellStart"/>
+      <w:r>
+        <w:rPr>
+          <w:rFonts w:ascii="Times New Roman" w:eastAsia="Times New Roman" w:hAnsi="Times New Roman" w:cs="Times New Roman"/>
+        </w:rPr>
+        <w:t>considerant</w:t>
+      </w:r>
+      <w:proofErr w:type="spellEnd"/>
+      <w:r>
+        <w:rPr>
+          <w:rFonts w:ascii="Times New Roman" w:eastAsia="Times New Roman" w:hAnsi="Times New Roman" w:cs="Times New Roman"/>
+        </w:rPr>
+        <w:t xml:space="preserve"> </w:t>
+      </w:r>
+      <w:proofErr w:type="spellStart"/>
+      <w:r>
+        <w:rPr>
+          <w:rFonts w:ascii="Times New Roman" w:eastAsia="Times New Roman" w:hAnsi="Times New Roman" w:cs="Times New Roman"/>
+        </w:rPr>
+        <w:t>criteris</w:t>
+      </w:r>
+      <w:proofErr w:type="spellEnd"/>
+      <w:r>
+        <w:rPr>
+          <w:rFonts w:ascii="Times New Roman" w:eastAsia="Times New Roman" w:hAnsi="Times New Roman" w:cs="Times New Roman"/>
+        </w:rPr>
+        <w:t xml:space="preserve"> </w:t>
+      </w:r>
+      <w:proofErr w:type="spellStart"/>
+      <w:r>
+        <w:rPr>
+          <w:rFonts w:ascii="Times New Roman" w:eastAsia="Times New Roman" w:hAnsi="Times New Roman" w:cs="Times New Roman"/>
+        </w:rPr>
+        <w:t>operatius</w:t>
+      </w:r>
+      <w:proofErr w:type="spellEnd"/>
+      <w:r>
+        <w:rPr>
+          <w:rFonts w:ascii="Times New Roman" w:eastAsia="Times New Roman" w:hAnsi="Times New Roman" w:cs="Times New Roman"/>
+        </w:rPr>
+        <w:t xml:space="preserve">, </w:t>
+      </w:r>
+      <w:proofErr w:type="spellStart"/>
+      <w:r>
+        <w:rPr>
+          <w:rFonts w:ascii="Times New Roman" w:eastAsia="Times New Roman" w:hAnsi="Times New Roman" w:cs="Times New Roman"/>
+        </w:rPr>
+        <w:t>ambientals</w:t>
+      </w:r>
+      <w:proofErr w:type="spellEnd"/>
+      <w:r>
+        <w:rPr>
+          <w:rFonts w:ascii="Times New Roman" w:eastAsia="Times New Roman" w:hAnsi="Times New Roman" w:cs="Times New Roman"/>
+        </w:rPr>
+        <w:t xml:space="preserve"> i </w:t>
+      </w:r>
+      <w:proofErr w:type="spellStart"/>
+      <w:r>
+        <w:rPr>
+          <w:rFonts w:ascii="Times New Roman" w:eastAsia="Times New Roman" w:hAnsi="Times New Roman" w:cs="Times New Roman"/>
+        </w:rPr>
+        <w:t>socioespacials</w:t>
+      </w:r>
+      <w:proofErr w:type="spellEnd"/>
+      <w:r>
+        <w:rPr>
+          <w:rFonts w:ascii="Times New Roman" w:eastAsia="Times New Roman" w:hAnsi="Times New Roman" w:cs="Times New Roman"/>
+        </w:rPr>
+        <w:t xml:space="preserve">, i </w:t>
+      </w:r>
+      <w:proofErr w:type="spellStart"/>
+      <w:r>
+        <w:rPr>
+          <w:rFonts w:ascii="Times New Roman" w:eastAsia="Times New Roman" w:hAnsi="Times New Roman" w:cs="Times New Roman"/>
+        </w:rPr>
+        <w:t>integrant</w:t>
+      </w:r>
+      <w:proofErr w:type="spellEnd"/>
+      <w:r>
+        <w:rPr>
+          <w:rFonts w:ascii="Times New Roman" w:eastAsia="Times New Roman" w:hAnsi="Times New Roman" w:cs="Times New Roman"/>
+        </w:rPr>
+        <w:t xml:space="preserve"> la </w:t>
+      </w:r>
+      <w:proofErr w:type="spellStart"/>
+      <w:r>
+        <w:rPr>
+          <w:rFonts w:ascii="Times New Roman" w:eastAsia="Times New Roman" w:hAnsi="Times New Roman" w:cs="Times New Roman"/>
+        </w:rPr>
+        <w:t>possibilitat</w:t>
+      </w:r>
+      <w:proofErr w:type="spellEnd"/>
+      <w:r>
+        <w:rPr>
+          <w:rFonts w:ascii="Times New Roman" w:eastAsia="Times New Roman" w:hAnsi="Times New Roman" w:cs="Times New Roman"/>
+        </w:rPr>
+        <w:t xml:space="preserve"> de </w:t>
+      </w:r>
+      <w:proofErr w:type="spellStart"/>
+      <w:r>
+        <w:rPr>
+          <w:rFonts w:ascii="Times New Roman" w:eastAsia="Times New Roman" w:hAnsi="Times New Roman" w:cs="Times New Roman"/>
+        </w:rPr>
+        <w:t>prioritzar</w:t>
+      </w:r>
+      <w:proofErr w:type="spellEnd"/>
+      <w:r>
+        <w:rPr>
+          <w:rFonts w:ascii="Times New Roman" w:eastAsia="Times New Roman" w:hAnsi="Times New Roman" w:cs="Times New Roman"/>
+        </w:rPr>
+        <w:t xml:space="preserve"> </w:t>
+      </w:r>
+      <w:proofErr w:type="spellStart"/>
+      <w:r>
+        <w:rPr>
+          <w:rFonts w:ascii="Times New Roman" w:eastAsia="Times New Roman" w:hAnsi="Times New Roman" w:cs="Times New Roman"/>
+        </w:rPr>
+        <w:t>zones</w:t>
+      </w:r>
+      <w:proofErr w:type="spellEnd"/>
+      <w:r>
+        <w:rPr>
+          <w:rFonts w:ascii="Times New Roman" w:eastAsia="Times New Roman" w:hAnsi="Times New Roman" w:cs="Times New Roman"/>
+        </w:rPr>
+        <w:t xml:space="preserve"> </w:t>
+      </w:r>
+      <w:proofErr w:type="spellStart"/>
+      <w:r>
+        <w:rPr>
+          <w:rFonts w:ascii="Times New Roman" w:eastAsia="Times New Roman" w:hAnsi="Times New Roman" w:cs="Times New Roman"/>
+        </w:rPr>
+        <w:t>amb</w:t>
+      </w:r>
+      <w:proofErr w:type="spellEnd"/>
+      <w:r>
+        <w:rPr>
+          <w:rFonts w:ascii="Times New Roman" w:eastAsia="Times New Roman" w:hAnsi="Times New Roman" w:cs="Times New Roman"/>
+        </w:rPr>
+        <w:t xml:space="preserve"> </w:t>
+      </w:r>
+      <w:proofErr w:type="spellStart"/>
+      <w:r>
+        <w:rPr>
+          <w:rFonts w:ascii="Times New Roman" w:eastAsia="Times New Roman" w:hAnsi="Times New Roman" w:cs="Times New Roman"/>
+        </w:rPr>
+        <w:t>major</w:t>
+      </w:r>
+      <w:proofErr w:type="spellEnd"/>
+      <w:r>
+        <w:rPr>
+          <w:rFonts w:ascii="Times New Roman" w:eastAsia="Times New Roman" w:hAnsi="Times New Roman" w:cs="Times New Roman"/>
+        </w:rPr>
+        <w:t xml:space="preserve"> </w:t>
+      </w:r>
+      <w:proofErr w:type="spellStart"/>
+      <w:r>
+        <w:rPr>
+          <w:rFonts w:ascii="Times New Roman" w:eastAsia="Times New Roman" w:hAnsi="Times New Roman" w:cs="Times New Roman"/>
+        </w:rPr>
+        <w:t>vulnerabilitat</w:t>
+      </w:r>
+      <w:proofErr w:type="spellEnd"/>
+      <w:r>
+        <w:rPr>
+          <w:rFonts w:ascii="Times New Roman" w:eastAsia="Times New Roman" w:hAnsi="Times New Roman" w:cs="Times New Roman"/>
+        </w:rPr>
+        <w:t xml:space="preserve"> per </w:t>
+      </w:r>
+      <w:proofErr w:type="spellStart"/>
+      <w:r>
+        <w:rPr>
+          <w:rFonts w:ascii="Times New Roman" w:eastAsia="Times New Roman" w:hAnsi="Times New Roman" w:cs="Times New Roman"/>
+        </w:rPr>
+        <w:t>afavorir</w:t>
+      </w:r>
+      <w:proofErr w:type="spellEnd"/>
+      <w:r>
+        <w:rPr>
+          <w:rFonts w:ascii="Times New Roman" w:eastAsia="Times New Roman" w:hAnsi="Times New Roman" w:cs="Times New Roman"/>
+        </w:rPr>
+        <w:t xml:space="preserve"> una </w:t>
+      </w:r>
+      <w:proofErr w:type="spellStart"/>
+      <w:r>
+        <w:rPr>
+          <w:rFonts w:ascii="Times New Roman" w:eastAsia="Times New Roman" w:hAnsi="Times New Roman" w:cs="Times New Roman"/>
+        </w:rPr>
+        <w:t>distribució</w:t>
+      </w:r>
+      <w:proofErr w:type="spellEnd"/>
+      <w:r>
+        <w:rPr>
+          <w:rFonts w:ascii="Times New Roman" w:eastAsia="Times New Roman" w:hAnsi="Times New Roman" w:cs="Times New Roman"/>
+        </w:rPr>
+        <w:t xml:space="preserve"> </w:t>
+      </w:r>
+      <w:proofErr w:type="spellStart"/>
+      <w:r>
+        <w:rPr>
+          <w:rFonts w:ascii="Times New Roman" w:eastAsia="Times New Roman" w:hAnsi="Times New Roman" w:cs="Times New Roman"/>
+        </w:rPr>
+        <w:t>més</w:t>
+      </w:r>
+      <w:proofErr w:type="spellEnd"/>
+      <w:r>
+        <w:rPr>
+          <w:rFonts w:ascii="Times New Roman" w:eastAsia="Times New Roman" w:hAnsi="Times New Roman" w:cs="Times New Roman"/>
+        </w:rPr>
+        <w:t xml:space="preserve"> justa i sostenible.</w:t>
       </w:r>
     </w:p>
     <w:p>
@@ -41,8 +350,21 @@
         </w:numPr>
       </w:pPr>
       <w:r>
-        <w:t>PR4, como se hace??? No tenemos e commerce??</w:t>
-      </w:r>
+        <w:t xml:space="preserve">PR4, como se hace??? </w:t>
+      </w:r>
+      <w:proofErr w:type="gramStart"/>
+      <w:r>
+        <w:t xml:space="preserve">No tenemos e </w:t>
+      </w:r>
+      <w:proofErr w:type="spellStart"/>
+      <w:r>
+        <w:t>commerce</w:t>
+      </w:r>
+      <w:proofErr w:type="spellEnd"/>
+      <w:r>
+        <w:t>??</w:t>
+      </w:r>
+      <w:proofErr w:type="gramEnd"/>
     </w:p>
     <w:p>
       <w:pPr>
@@ -53,8 +375,29 @@
         </w:numPr>
       </w:pPr>
       <w:r>
-        <w:t>300 paquetes al día el vehículo porque? Como? No hay ida y vuelta?</w:t>
-      </w:r>
+        <w:t xml:space="preserve">300 paquetes al día el vehículo </w:t>
+      </w:r>
+      <w:proofErr w:type="gramStart"/>
+      <w:r>
+        <w:t>porque</w:t>
+      </w:r>
+      <w:proofErr w:type="gramEnd"/>
+      <w:r>
+        <w:t xml:space="preserve">? </w:t>
+      </w:r>
+      <w:proofErr w:type="gramStart"/>
+      <w:r>
+        <w:t>Como?</w:t>
+      </w:r>
+      <w:proofErr w:type="gramEnd"/>
+      <w:r>
+        <w:t xml:space="preserve"> </w:t>
+      </w:r>
+      <w:proofErr w:type="gramStart"/>
+      <w:r>
+        <w:t>No hay ida y vuelta?</w:t>
+      </w:r>
+      <w:proofErr w:type="gramEnd"/>
     </w:p>
     <w:p>
       <w:pPr>
@@ -64,9 +407,19 @@
           <w:numId w:val="1"/>
         </w:numPr>
       </w:pPr>
-      <w:r>
-        <w:t>Me puedes explicar mejor la etapa de millora?</w:t>
-      </w:r>
+      <w:proofErr w:type="gramStart"/>
+      <w:r>
+        <w:t xml:space="preserve">Me puedes explicar mejor la etapa de </w:t>
+      </w:r>
+      <w:proofErr w:type="spellStart"/>
+      <w:r>
+        <w:t>millora</w:t>
+      </w:r>
+      <w:proofErr w:type="spellEnd"/>
+      <w:r>
+        <w:t>?</w:t>
+      </w:r>
+      <w:proofErr w:type="gramEnd"/>
     </w:p>
     <w:p>
       <w:pPr>
@@ -76,8 +429,21 @@
           <w:numId w:val="1"/>
         </w:numPr>
       </w:pPr>
-      <w:r>
-        <w:t xml:space="preserve">Solo bcn, o Madrid y val también? </w:t>
+      <w:proofErr w:type="gramStart"/>
+      <w:r>
+        <w:t xml:space="preserve">Solo </w:t>
+      </w:r>
+      <w:proofErr w:type="spellStart"/>
+      <w:r>
+        <w:t>bcn</w:t>
+      </w:r>
+      <w:proofErr w:type="spellEnd"/>
+      <w:r>
+        <w:t>, o Madrid y val también?</w:t>
+      </w:r>
+      <w:proofErr w:type="gramEnd"/>
+      <w:r>
+        <w:t xml:space="preserve"> </w:t>
       </w:r>
     </w:p>
     <w:p>
@@ -88,9 +454,11 @@
           <w:numId w:val="1"/>
         </w:numPr>
       </w:pPr>
+      <w:proofErr w:type="gramStart"/>
       <w:r>
         <w:t>Solo tres barrios?</w:t>
       </w:r>
+      <w:proofErr w:type="gramEnd"/>
     </w:p>
     <w:p>
       <w:pPr>
@@ -100,9 +468,40 @@
           <w:numId w:val="1"/>
         </w:numPr>
       </w:pPr>
+      <w:proofErr w:type="gramStart"/>
       <w:r>
         <w:t>Son comparables los modelos?</w:t>
       </w:r>
+      <w:proofErr w:type="gramEnd"/>
+    </w:p>
+    <w:p/>
+    <w:p>
+      <w:pPr>
+        <w:pStyle w:val="ListParagraph"/>
+        <w:numPr>
+          <w:ilvl w:val="0"/>
+          <w:numId w:val="1"/>
+        </w:numPr>
+      </w:pPr>
+      <w:proofErr w:type="gramStart"/>
+      <w:r>
+        <w:t>Me podéis explicar en que se basa la nueva propuesta que se ve en el correo para la fase 1??</w:t>
+      </w:r>
+      <w:proofErr w:type="gramEnd"/>
+    </w:p>
+    <w:p>
+      <w:pPr>
+        <w:pStyle w:val="ListParagraph"/>
+      </w:pPr>
+    </w:p>
+    <w:p>
+      <w:pPr>
+        <w:pStyle w:val="ListParagraph"/>
+        <w:numPr>
+          <w:ilvl w:val="0"/>
+          <w:numId w:val="1"/>
+        </w:numPr>
+      </w:pPr>
     </w:p>
     <w:sectPr>
       <w:pgSz w:w="11906" w:h="16838"/>

</xml_diff>